<commit_message>
court(calctapp2d): opening brief authorities sort alike in every engine (sort keys for amend XIV, §§ 28200-28255, Bruen; two rows no longer repeat their citation); latex left with the ")—" gap only, still reported (fb-595.54.66)
Co-Authored-By: Claude Opus 5.5 <noreply@anthropic.com>
</commit_message>
<xml_diff>
--- a/courts/ninth-circuit/california/state/court-of-appeal-second-district/opening-brief/usage/OUTPUT-opening-brief.docx
+++ b/courts/ninth-circuit/california/state/court-of-appeal-second-district/opening-brief/usage/OUTPUT-opening-brief.docx
@@ -7129,13 +7129,13 @@
         <w:t xml:space="preserve"> </w:t>
       </w:r>
       <w:r>
-        <w:t xml:space="preserve">amend.</w:t>
-      </w:r>
-      <w:r>
-        <w:t xml:space="preserve"> </w:t>
-      </w:r>
-      <w:r>
-        <w:t xml:space="preserve">II</w:t>
+        <w:t xml:space="preserve">amend</w:t>
+      </w:r>
+      <w:r>
+        <w:t xml:space="preserve"> </w:t>
+      </w:r>
+      <w:r>
+        <w:t xml:space="preserve">XIV</w:t>
       </w:r>
       <w:r>
         <w:t xml:space="preserve">   </w:t>
@@ -7169,13 +7169,13 @@
         <w:t xml:space="preserve"> </w:t>
       </w:r>
       <w:r>
-        <w:t xml:space="preserve">amend</w:t>
-      </w:r>
-      <w:r>
-        <w:t xml:space="preserve"> </w:t>
-      </w:r>
-      <w:r>
-        <w:t xml:space="preserve">XIV</w:t>
+        <w:t xml:space="preserve">amend.</w:t>
+      </w:r>
+      <w:r>
+        <w:t xml:space="preserve"> </w:t>
+      </w:r>
+      <w:r>
+        <w:t xml:space="preserve">II</w:t>
       </w:r>
       <w:r>
         <w:t xml:space="preserve">   </w:t>
@@ -7443,6 +7443,46 @@
         <w:t xml:space="preserve"> </w:t>
       </w:r>
       <w:r>
+        <w:t xml:space="preserve">11340</w:t>
+      </w:r>
+      <w:r>
+        <w:t xml:space="preserve">   </w:t>
+      </w:r>
+      <w:r>
+        <w:tab/>
+      </w:r>
+      <w:r>
+        <w:t xml:space="preserve">46</w:t>
+      </w:r>
+    </w:p>
+    <w:p>
+      <w:pPr>
+        <w:keepLines/>
+        <w:tabs>
+          <w:tab w:val="right" w:leader="dot" w:pos="7920"/>
+        </w:tabs>
+        <w:spacing w:before="182" w:after="0" w:line="312" w:lineRule="exact"/>
+        <w:ind w:left="504" w:right="720" w:hanging="504"/>
+      </w:pPr>
+      <w:r>
+        <w:t xml:space="preserve">Gov.</w:t>
+      </w:r>
+      <w:r>
+        <w:t xml:space="preserve"> </w:t>
+      </w:r>
+      <w:r>
+        <w:t xml:space="preserve">Code,</w:t>
+      </w:r>
+      <w:r>
+        <w:t xml:space="preserve"> </w:t>
+      </w:r>
+      <w:r>
+        <w:t xml:space="preserve">§</w:t>
+      </w:r>
+      <w:r>
+        <w:t xml:space="preserve"> </w:t>
+      </w:r>
+      <w:r>
         <w:t xml:space="preserve">815.6</w:t>
       </w:r>
       <w:r>
@@ -8303,6 +8343,22 @@
     </w:p>
     <w:p>
       <w:pPr>
+        <w:keepNext/>
+        <w:keepLines/>
+        <w:spacing w:before="364" w:after="52" w:line="312" w:lineRule="exact"/>
+        <w:ind w:left="0" w:firstLine="0"/>
+        <w:jc w:val="left"/>
+      </w:pPr>
+      <w:r>
+        <w:rPr>
+          <w:b/>
+          <w:bCs/>
+        </w:rPr>
+        <w:t xml:space="preserve">Regulations:</w:t>
+      </w:r>
+    </w:p>
+    <w:p>
+      <w:pPr>
         <w:keepLines/>
         <w:tabs>
           <w:tab w:val="right" w:leader="dot" w:pos="7920"/>
@@ -8311,13 +8367,31 @@
         <w:ind w:left="504" w:right="720" w:hanging="504"/>
       </w:pPr>
       <w:r>
-        <w:t xml:space="preserve">Gov.</w:t>
-      </w:r>
-      <w:r>
-        <w:t xml:space="preserve"> </w:t>
-      </w:r>
-      <w:r>
-        <w:t xml:space="preserve">Code,</w:t>
+        <w:t xml:space="preserve">Cal.</w:t>
+      </w:r>
+      <w:r>
+        <w:t xml:space="preserve"> </w:t>
+      </w:r>
+      <w:r>
+        <w:t xml:space="preserve">Code</w:t>
+      </w:r>
+      <w:r>
+        <w:t xml:space="preserve"> </w:t>
+      </w:r>
+      <w:r>
+        <w:t xml:space="preserve">Regs.,</w:t>
+      </w:r>
+      <w:r>
+        <w:t xml:space="preserve"> </w:t>
+      </w:r>
+      <w:r>
+        <w:t xml:space="preserve">tit.</w:t>
+      </w:r>
+      <w:r>
+        <w:t xml:space="preserve"> </w:t>
+      </w:r>
+      <w:r>
+        <w:t xml:space="preserve">11,</w:t>
       </w:r>
       <w:r>
         <w:t xml:space="preserve"> </w:t>
@@ -8329,43 +8403,7 @@
         <w:t xml:space="preserve"> </w:t>
       </w:r>
       <w:r>
-        <w:t xml:space="preserve">11340,</w:t>
-      </w:r>
-      <w:r>
-        <w:t xml:space="preserve"> </w:t>
-      </w:r>
-      <w:r>
-        <w:t xml:space="preserve">Gov.</w:t>
-      </w:r>
-      <w:r>
-        <w:t xml:space="preserve"> </w:t>
-      </w:r>
-      <w:r>
-        <w:t xml:space="preserve">Code,</w:t>
-      </w:r>
-      <w:r>
-        <w:t xml:space="preserve"> </w:t>
-      </w:r>
-      <w:r>
-        <w:t xml:space="preserve">§</w:t>
-      </w:r>
-      <w:r>
-        <w:t xml:space="preserve"> </w:t>
-      </w:r>
-      <w:r>
-        <w:t xml:space="preserve">11340</w:t>
-      </w:r>
-      <w:r>
-        <w:t xml:space="preserve"> </w:t>
-      </w:r>
-      <w:r>
-        <w:t xml:space="preserve">et</w:t>
-      </w:r>
-      <w:r>
-        <w:t xml:space="preserve"> </w:t>
-      </w:r>
-      <w:r>
-        <w:t xml:space="preserve">seq.</w:t>
+        <w:t xml:space="preserve">4210</w:t>
       </w:r>
       <w:r>
         <w:t xml:space="preserve">   </w:t>
@@ -8374,7 +8412,7 @@
         <w:tab/>
       </w:r>
       <w:r>
-        <w:t xml:space="preserve">46</w:t>
+        <w:t xml:space="preserve">14</w:t>
       </w:r>
     </w:p>
     <w:p>
@@ -8390,7 +8428,21 @@
           <w:b/>
           <w:bCs/>
         </w:rPr>
-        <w:t xml:space="preserve">Regulations:</w:t>
+        <w:t xml:space="preserve">Other</w:t>
+      </w:r>
+      <w:r>
+        <w:rPr>
+          <w:b/>
+          <w:bCs/>
+        </w:rPr>
+        <w:t xml:space="preserve"> </w:t>
+      </w:r>
+      <w:r>
+        <w:rPr>
+          <w:b/>
+          <w:bCs/>
+        </w:rPr>
+        <w:t xml:space="preserve">Authorities:</w:t>
       </w:r>
     </w:p>
     <w:p>
@@ -8403,43 +8455,85 @@
         <w:ind w:left="504" w:right="720" w:hanging="504"/>
       </w:pPr>
       <w:r>
-        <w:t xml:space="preserve">Cal.</w:t>
-      </w:r>
-      <w:r>
-        <w:t xml:space="preserve"> </w:t>
-      </w:r>
-      <w:r>
-        <w:t xml:space="preserve">Code</w:t>
-      </w:r>
-      <w:r>
-        <w:t xml:space="preserve"> </w:t>
-      </w:r>
-      <w:r>
-        <w:t xml:space="preserve">Regs.,</w:t>
-      </w:r>
-      <w:r>
-        <w:t xml:space="preserve"> </w:t>
-      </w:r>
-      <w:r>
-        <w:t xml:space="preserve">tit.</w:t>
-      </w:r>
-      <w:r>
-        <w:t xml:space="preserve"> </w:t>
-      </w:r>
-      <w:r>
-        <w:t xml:space="preserve">11,</w:t>
-      </w:r>
-      <w:r>
-        <w:t xml:space="preserve"> </w:t>
-      </w:r>
-      <w:r>
-        <w:t xml:space="preserve">§</w:t>
-      </w:r>
-      <w:r>
-        <w:t xml:space="preserve"> </w:t>
-      </w:r>
-      <w:r>
-        <w:t xml:space="preserve">4210</w:t>
+        <w:t xml:space="preserve">Office</w:t>
+      </w:r>
+      <w:r>
+        <w:t xml:space="preserve"> </w:t>
+      </w:r>
+      <w:r>
+        <w:t xml:space="preserve">of</w:t>
+      </w:r>
+      <w:r>
+        <w:t xml:space="preserve"> </w:t>
+      </w:r>
+      <w:r>
+        <w:t xml:space="preserve">Administrative</w:t>
+      </w:r>
+      <w:r>
+        <w:t xml:space="preserve"> </w:t>
+      </w:r>
+      <w:r>
+        <w:t xml:space="preserve">Law,</w:t>
+      </w:r>
+      <w:r>
+        <w:t xml:space="preserve"> </w:t>
+      </w:r>
+      <w:r>
+        <w:t xml:space="preserve">State</w:t>
+      </w:r>
+      <w:r>
+        <w:t xml:space="preserve"> </w:t>
+      </w:r>
+      <w:r>
+        <w:t xml:space="preserve">of</w:t>
+      </w:r>
+      <w:r>
+        <w:t xml:space="preserve"> </w:t>
+      </w:r>
+      <w:r>
+        <w:t xml:space="preserve">California,</w:t>
+      </w:r>
+      <w:r>
+        <w:t xml:space="preserve"> </w:t>
+      </w:r>
+      <w:r>
+        <w:t xml:space="preserve">Administrative</w:t>
+      </w:r>
+      <w:r>
+        <w:t xml:space="preserve"> </w:t>
+      </w:r>
+      <w:r>
+        <w:t xml:space="preserve">Procedure</w:t>
+      </w:r>
+      <w:r>
+        <w:t xml:space="preserve"> </w:t>
+      </w:r>
+      <w:r>
+        <w:t xml:space="preserve">Act</w:t>
+      </w:r>
+      <w:r>
+        <w:t xml:space="preserve"> </w:t>
+      </w:r>
+      <w:r>
+        <w:t xml:space="preserve">&amp;</w:t>
+      </w:r>
+      <w:r>
+        <w:t xml:space="preserve"> </w:t>
+      </w:r>
+      <w:r>
+        <w:t xml:space="preserve">OAL</w:t>
+      </w:r>
+      <w:r>
+        <w:t xml:space="preserve"> </w:t>
+      </w:r>
+      <w:r>
+        <w:t xml:space="preserve">Regulations,</w:t>
+      </w:r>
+      <w:r>
+        <w:t xml:space="preserve"> </w:t>
+      </w:r>
+      <w:r>
+        <w:t xml:space="preserve">https://​www.​oal.​ca.​gov/​publications/​administrative_procedure_act/</w:t>
       </w:r>
       <w:r>
         <w:t xml:space="preserve">   </w:t>
@@ -8448,37 +8542,7 @@
         <w:tab/>
       </w:r>
       <w:r>
-        <w:t xml:space="preserve">14</w:t>
-      </w:r>
-    </w:p>
-    <w:p>
-      <w:pPr>
-        <w:keepNext/>
-        <w:keepLines/>
-        <w:spacing w:before="364" w:after="52" w:line="312" w:lineRule="exact"/>
-        <w:ind w:left="0" w:firstLine="0"/>
-        <w:jc w:val="left"/>
-      </w:pPr>
-      <w:r>
-        <w:rPr>
-          <w:b/>
-          <w:bCs/>
-        </w:rPr>
-        <w:t xml:space="preserve">Other</w:t>
-      </w:r>
-      <w:r>
-        <w:rPr>
-          <w:b/>
-          <w:bCs/>
-        </w:rPr>
-        <w:t xml:space="preserve"> </w:t>
-      </w:r>
-      <w:r>
-        <w:rPr>
-          <w:b/>
-          <w:bCs/>
-        </w:rPr>
-        <w:t xml:space="preserve">Authorities:</w:t>
+        <w:t xml:space="preserve">46</w:t>
       </w:r>
     </w:p>
     <w:p>
@@ -8539,184 +8603,6 @@
       </w:r>
       <w:r>
         <w:t xml:space="preserve">9</w:t>
-      </w:r>
-    </w:p>
-    <w:p>
-      <w:pPr>
-        <w:keepLines/>
-        <w:tabs>
-          <w:tab w:val="right" w:leader="dot" w:pos="7920"/>
-        </w:tabs>
-        <w:spacing w:before="182" w:after="0" w:line="312" w:lineRule="exact"/>
-        <w:ind w:left="504" w:right="720" w:hanging="504"/>
-      </w:pPr>
-      <w:r>
-        <w:t xml:space="preserve">Office</w:t>
-      </w:r>
-      <w:r>
-        <w:t xml:space="preserve"> </w:t>
-      </w:r>
-      <w:r>
-        <w:t xml:space="preserve">of</w:t>
-      </w:r>
-      <w:r>
-        <w:t xml:space="preserve"> </w:t>
-      </w:r>
-      <w:r>
-        <w:t xml:space="preserve">Administrative</w:t>
-      </w:r>
-      <w:r>
-        <w:t xml:space="preserve"> </w:t>
-      </w:r>
-      <w:r>
-        <w:t xml:space="preserve">Law,</w:t>
-      </w:r>
-      <w:r>
-        <w:t xml:space="preserve"> </w:t>
-      </w:r>
-      <w:r>
-        <w:t xml:space="preserve">State</w:t>
-      </w:r>
-      <w:r>
-        <w:t xml:space="preserve"> </w:t>
-      </w:r>
-      <w:r>
-        <w:t xml:space="preserve">of</w:t>
-      </w:r>
-      <w:r>
-        <w:t xml:space="preserve"> </w:t>
-      </w:r>
-      <w:r>
-        <w:t xml:space="preserve">California,</w:t>
-      </w:r>
-      <w:r>
-        <w:t xml:space="preserve"> </w:t>
-      </w:r>
-      <w:r>
-        <w:t xml:space="preserve">Administrative</w:t>
-      </w:r>
-      <w:r>
-        <w:t xml:space="preserve"> </w:t>
-      </w:r>
-      <w:r>
-        <w:t xml:space="preserve">Procedure</w:t>
-      </w:r>
-      <w:r>
-        <w:t xml:space="preserve"> </w:t>
-      </w:r>
-      <w:r>
-        <w:t xml:space="preserve">Act</w:t>
-      </w:r>
-      <w:r>
-        <w:t xml:space="preserve"> </w:t>
-      </w:r>
-      <w:r>
-        <w:t xml:space="preserve">&amp;</w:t>
-      </w:r>
-      <w:r>
-        <w:t xml:space="preserve"> </w:t>
-      </w:r>
-      <w:r>
-        <w:t xml:space="preserve">OAL</w:t>
-      </w:r>
-      <w:r>
-        <w:t xml:space="preserve"> </w:t>
-      </w:r>
-      <w:r>
-        <w:t xml:space="preserve">Regulations,</w:t>
-      </w:r>
-      <w:r>
-        <w:t xml:space="preserve"> </w:t>
-      </w:r>
-      <w:r>
-        <w:t xml:space="preserve">Office</w:t>
-      </w:r>
-      <w:r>
-        <w:t xml:space="preserve"> </w:t>
-      </w:r>
-      <w:r>
-        <w:t xml:space="preserve">of</w:t>
-      </w:r>
-      <w:r>
-        <w:t xml:space="preserve"> </w:t>
-      </w:r>
-      <w:r>
-        <w:t xml:space="preserve">Administrative</w:t>
-      </w:r>
-      <w:r>
-        <w:t xml:space="preserve"> </w:t>
-      </w:r>
-      <w:r>
-        <w:t xml:space="preserve">Law,</w:t>
-      </w:r>
-      <w:r>
-        <w:t xml:space="preserve"> </w:t>
-      </w:r>
-      <w:r>
-        <w:t xml:space="preserve">State</w:t>
-      </w:r>
-      <w:r>
-        <w:t xml:space="preserve"> </w:t>
-      </w:r>
-      <w:r>
-        <w:t xml:space="preserve">of</w:t>
-      </w:r>
-      <w:r>
-        <w:t xml:space="preserve"> </w:t>
-      </w:r>
-      <w:r>
-        <w:t xml:space="preserve">California,</w:t>
-      </w:r>
-      <w:r>
-        <w:t xml:space="preserve"> </w:t>
-      </w:r>
-      <w:r>
-        <w:t xml:space="preserve">Administrative</w:t>
-      </w:r>
-      <w:r>
-        <w:t xml:space="preserve"> </w:t>
-      </w:r>
-      <w:r>
-        <w:t xml:space="preserve">Procedure</w:t>
-      </w:r>
-      <w:r>
-        <w:t xml:space="preserve"> </w:t>
-      </w:r>
-      <w:r>
-        <w:t xml:space="preserve">Act</w:t>
-      </w:r>
-      <w:r>
-        <w:t xml:space="preserve"> </w:t>
-      </w:r>
-      <w:r>
-        <w:t xml:space="preserve">&amp;</w:t>
-      </w:r>
-      <w:r>
-        <w:t xml:space="preserve"> </w:t>
-      </w:r>
-      <w:r>
-        <w:t xml:space="preserve">OAL</w:t>
-      </w:r>
-      <w:r>
-        <w:t xml:space="preserve"> </w:t>
-      </w:r>
-      <w:r>
-        <w:t xml:space="preserve">Regulations,</w:t>
-      </w:r>
-      <w:r>
-        <w:t xml:space="preserve"> </w:t>
-      </w:r>
-      <w:r>
-        <w:t xml:space="preserve">https://​www.​oal.​ca.​gov/​publications/​administrative_procedure_act/</w:t>
-      </w:r>
-      <w:r>
-        <w:t xml:space="preserve">   </w:t>
-      </w:r>
-      <w:r>
-        <w:tab/>
-      </w:r>
-      <w:r>
-        <w:t xml:space="preserve">46</w:t>
       </w:r>
     </w:p>
     <w:p>

</xml_diff>